<commit_message>
docs: update Rev 4 source requirements document
Co-Authored-By: Claude Opus 4.7 <noreply@anthropic.com>
</commit_message>
<xml_diff>
--- a/.Improvements/Rev 4/Claude REV 4.docx
+++ b/.Improvements/Rev 4/Claude REV 4.docx
@@ -42,7 +42,15 @@
     </w:p>
     <w:p>
       <w:r>
-        <w:t>/grill-me</w:t>
+        <w:t>/</w:t>
+      </w:r>
+      <w:proofErr w:type="gramStart"/>
+      <w:r>
+        <w:t>grill</w:t>
+      </w:r>
+      <w:proofErr w:type="gramEnd"/>
+      <w:r>
+        <w:t>-me</w:t>
       </w:r>
       <w:r>
         <w:t xml:space="preserve"> </w:t>
@@ -111,7 +119,15 @@
         </w:numPr>
       </w:pPr>
       <w:r>
-        <w:t xml:space="preserve">Create the ability for the user to also export the file as a file that could be imported into the page at a later date. This means </w:t>
+        <w:t xml:space="preserve">Create the ability for the user to also export the file as a file that could be imported into the page </w:t>
+      </w:r>
+      <w:proofErr w:type="gramStart"/>
+      <w:r>
+        <w:t>at a later date</w:t>
+      </w:r>
+      <w:proofErr w:type="gramEnd"/>
+      <w:r>
+        <w:t xml:space="preserve">. This means </w:t>
       </w:r>
       <w:r>
         <w:t>an</w:t>
@@ -203,10 +219,18 @@
     </w:p>
     <w:p>
       <w:r>
-        <w:t>"C:\Users\socoo\.projects\01 Steel Beam\.Improvements\Rev 3\HANDOVER.md"</w:t>
-      </w:r>
-      <w:r>
-        <w:t xml:space="preserve">  read document, design orchestration. use existing kanban to lodge and</w:t>
+        <w:t>"C:\Users\socoo\.projects\01 Steel Beam\.Improvements\Rev 4\HANDOVER.md</w:t>
+      </w:r>
+      <w:proofErr w:type="gramStart"/>
+      <w:r>
+        <w:t>"</w:t>
+      </w:r>
+      <w:r>
+        <w:t xml:space="preserve">  read</w:t>
+      </w:r>
+      <w:proofErr w:type="gramEnd"/>
+      <w:r>
+        <w:t xml:space="preserve"> document, design orchestration. use existing kanban to lodge and</w:t>
       </w:r>
     </w:p>
     <w:p>
@@ -261,7 +285,7 @@
     </w:p>
     <w:p>
       <w:r>
-        <w:t>"C:\Users\socoo\.projects\01 Steel Beam\.nova\REV3-ORCHESTRATION-PLAN.md"</w:t>
+        <w:t>"C:\Users\socoo\.projects\01 Steel Beam\.nova\REV4-ORCHESTRATION-PLAN.md"</w:t>
       </w:r>
       <w:r>
         <w:t xml:space="preserve"> </w:t>

</xml_diff>